<commit_message>
remove reload after submit
</commit_message>
<xml_diff>
--- a/Test.docx
+++ b/Test.docx
@@ -179,14 +179,12 @@
           <w:lang w:val="en-US"/>
         </w:rPr>
       </w:pPr>
-      <w:proofErr w:type="spellStart"/>
       <w:r>
         <w:rPr>
           <w:lang w:val="en-US"/>
         </w:rPr>
         <w:t>NaN</w:t>
       </w:r>
-      <w:proofErr w:type="spellEnd"/>
     </w:p>
     <w:p>
       <w:pPr>
@@ -314,19 +312,11 @@
           <w:lang w:val="en-US"/>
         </w:rPr>
       </w:pPr>
-      <w:proofErr w:type="spellStart"/>
-      <w:r>
-        <w:rPr>
-          <w:lang w:val="en-US"/>
-        </w:rPr>
-        <w:t>NaN</w:t>
-      </w:r>
-      <w:proofErr w:type="spellEnd"/>
-      <w:r>
-        <w:rPr>
-          <w:lang w:val="en-US"/>
-        </w:rPr>
-        <w:t xml:space="preserve"> price</w:t>
+      <w:r>
+        <w:rPr>
+          <w:lang w:val="en-US"/>
+        </w:rPr>
+        <w:t>NaN price</w:t>
       </w:r>
     </w:p>
     <w:p>
@@ -402,21 +392,7 @@
         <w:rPr>
           <w:lang w:val="en-US"/>
         </w:rPr>
-        <w:t xml:space="preserve">Non </w:t>
-      </w:r>
-      <w:proofErr w:type="spellStart"/>
-      <w:r>
-        <w:rPr>
-          <w:lang w:val="en-US"/>
-        </w:rPr>
-        <w:t>latin</w:t>
-      </w:r>
-      <w:proofErr w:type="spellEnd"/>
-      <w:r>
-        <w:rPr>
-          <w:lang w:val="en-US"/>
-        </w:rPr>
-        <w:t xml:space="preserve"> variant</w:t>
+        <w:t>Non latin variant</w:t>
       </w:r>
     </w:p>
     <w:p>
@@ -450,19 +426,11 @@
           <w:lang w:val="en-US"/>
         </w:rPr>
       </w:pPr>
-      <w:proofErr w:type="spellStart"/>
-      <w:r>
-        <w:rPr>
-          <w:lang w:val="en-US"/>
-        </w:rPr>
-        <w:t>NaN</w:t>
-      </w:r>
-      <w:proofErr w:type="spellEnd"/>
-      <w:r>
-        <w:rPr>
-          <w:lang w:val="en-US"/>
-        </w:rPr>
-        <w:t xml:space="preserve"> unit</w:t>
+      <w:r>
+        <w:rPr>
+          <w:lang w:val="en-US"/>
+        </w:rPr>
+        <w:t>NaN unit</w:t>
       </w:r>
     </w:p>
     <w:p>
@@ -519,21 +487,7 @@
         <w:rPr>
           <w:lang w:val="en-US"/>
         </w:rPr>
-        <w:t xml:space="preserve">Non </w:t>
-      </w:r>
-      <w:proofErr w:type="spellStart"/>
-      <w:r>
-        <w:rPr>
-          <w:lang w:val="en-US"/>
-        </w:rPr>
-        <w:t>latin</w:t>
-      </w:r>
-      <w:proofErr w:type="spellEnd"/>
-      <w:r>
-        <w:rPr>
-          <w:lang w:val="en-US"/>
-        </w:rPr>
-        <w:t xml:space="preserve"> name</w:t>
+        <w:t>Non latin name</w:t>
       </w:r>
     </w:p>
     <w:p>
@@ -571,21 +525,7 @@
         <w:rPr>
           <w:lang w:val="en-US"/>
         </w:rPr>
-        <w:t xml:space="preserve">Non </w:t>
-      </w:r>
-      <w:proofErr w:type="spellStart"/>
-      <w:r>
-        <w:rPr>
-          <w:lang w:val="en-US"/>
-        </w:rPr>
-        <w:t>latin</w:t>
-      </w:r>
-      <w:proofErr w:type="spellEnd"/>
-      <w:r>
-        <w:rPr>
-          <w:lang w:val="en-US"/>
-        </w:rPr>
-        <w:t xml:space="preserve"> variant</w:t>
+        <w:t>Non latin variant</w:t>
       </w:r>
     </w:p>
     <w:p>
@@ -619,19 +559,11 @@
           <w:lang w:val="en-US"/>
         </w:rPr>
       </w:pPr>
-      <w:proofErr w:type="spellStart"/>
-      <w:r>
-        <w:rPr>
-          <w:lang w:val="en-US"/>
-        </w:rPr>
-        <w:t>NaN</w:t>
-      </w:r>
-      <w:proofErr w:type="spellEnd"/>
-      <w:r>
-        <w:rPr>
-          <w:lang w:val="en-US"/>
-        </w:rPr>
-        <w:t xml:space="preserve"> unit</w:t>
+      <w:r>
+        <w:rPr>
+          <w:lang w:val="en-US"/>
+        </w:rPr>
+        <w:t>NaN unit</w:t>
       </w:r>
     </w:p>
     <w:p>
@@ -783,21 +715,7 @@
         <w:rPr>
           <w:lang w:val="en-US"/>
         </w:rPr>
-        <w:t xml:space="preserve">Non </w:t>
-      </w:r>
-      <w:proofErr w:type="spellStart"/>
-      <w:r>
-        <w:rPr>
-          <w:lang w:val="en-US"/>
-        </w:rPr>
-        <w:t>latin</w:t>
-      </w:r>
-      <w:proofErr w:type="spellEnd"/>
-      <w:r>
-        <w:rPr>
-          <w:lang w:val="en-US"/>
-        </w:rPr>
-        <w:t xml:space="preserve"> shop name</w:t>
+        <w:t>Non latin shop name</w:t>
       </w:r>
       <w:r>
         <w:rPr>
@@ -873,21 +791,25 @@
         <w:rPr>
           <w:lang w:val="en-US"/>
         </w:rPr>
-        <w:t xml:space="preserve">on </w:t>
-      </w:r>
-      <w:proofErr w:type="spellStart"/>
-      <w:r>
-        <w:rPr>
-          <w:lang w:val="en-US"/>
-        </w:rPr>
-        <w:t>latin</w:t>
-      </w:r>
-      <w:proofErr w:type="spellEnd"/>
-      <w:r>
-        <w:rPr>
-          <w:lang w:val="en-US"/>
-        </w:rPr>
-        <w:t xml:space="preserve"> unit</w:t>
+        <w:t>on latin unit</w:t>
+      </w:r>
+      <w:r>
+        <w:rPr>
+          <w:lang w:val="en-US"/>
+        </w:rPr>
+        <w:t xml:space="preserve"> </w:t>
+      </w:r>
+      <w:r>
+        <w:rPr>
+          <w:lang w:val="en-US"/>
+        </w:rPr>
+        <w:t>(</w:t>
+      </w:r>
+      <w:r>
+        <w:t>à, á, â, ä, ç, é, è, ê, ë, ñ, ö, ü, ß, etc..</w:t>
+      </w:r>
+      <w:r>
+        <w:t>)</w:t>
       </w:r>
     </w:p>
     <w:p>

</xml_diff>